<commit_message>
Final: title page in docx, v2.1 status, verified model hashes in README (Qwen re-download byte-exact, BitNet GGUF reconversion 332/332 tensors identical), manifest rev 27.10 (84 entries)
</commit_message>
<xml_diff>
--- a/paper/article_bitnet_agents_ru.docx
+++ b/paper/article_bitnet_agents_ru.docx
@@ -4,6 +4,179 @@
   <w:body>
     <w:p>
       <w:pPr>
+        <w:spacing w:before="0" w:after="0"/>
+        <w:jc w:val="center"/>
+      </w:pPr>
+      <w:r>
+        <w:rPr>
+          <w:rFonts w:ascii="Times New Roman" w:hAnsi="Times New Roman"/>
+          <w:b w:val="0"/>
+          <w:sz w:val="28"/>
+        </w:rPr>
+        <w:t>Министерство науки и высшего образования Российской Федерации</w:t>
+      </w:r>
+    </w:p>
+    <w:p>
+      <w:pPr>
+        <w:spacing w:before="0" w:after="0"/>
+        <w:jc w:val="center"/>
+      </w:pPr>
+      <w:r>
+        <w:rPr>
+          <w:rFonts w:ascii="Times New Roman" w:hAnsi="Times New Roman"/>
+          <w:b/>
+          <w:sz w:val="28"/>
+        </w:rPr>
+        <w:t>[ПОЛНОЕ НАИМЕНОВАНИЕ УНИВЕРСИТЕТА]</w:t>
+      </w:r>
+    </w:p>
+    <w:p>
+      <w:pPr>
+        <w:spacing w:before="0" w:after="0"/>
+        <w:jc w:val="center"/>
+      </w:pPr>
+      <w:r>
+        <w:rPr>
+          <w:rFonts w:ascii="Times New Roman" w:hAnsi="Times New Roman"/>
+          <w:b w:val="0"/>
+          <w:sz w:val="28"/>
+        </w:rPr>
+        <w:t>[Факультет / институт]</w:t>
+      </w:r>
+    </w:p>
+    <w:p>
+      <w:pPr>
+        <w:spacing w:before="0" w:after="1440"/>
+        <w:jc w:val="center"/>
+      </w:pPr>
+      <w:r>
+        <w:rPr>
+          <w:rFonts w:ascii="Times New Roman" w:hAnsi="Times New Roman"/>
+          <w:b w:val="0"/>
+          <w:sz w:val="28"/>
+        </w:rPr>
+        <w:t>[Кафедра]</w:t>
+      </w:r>
+    </w:p>
+    <w:p>
+      <w:pPr>
+        <w:spacing w:before="1440" w:after="360"/>
+        <w:jc w:val="center"/>
+      </w:pPr>
+      <w:r>
+        <w:rPr>
+          <w:rFonts w:ascii="Times New Roman" w:hAnsi="Times New Roman"/>
+          <w:b/>
+          <w:sz w:val="32"/>
+        </w:rPr>
+        <w:t>НАУЧНАЯ СТАТЬЯ</w:t>
+      </w:r>
+    </w:p>
+    <w:p>
+      <w:pPr>
+        <w:spacing w:before="0" w:after="2160"/>
+        <w:jc w:val="center"/>
+      </w:pPr>
+      <w:r>
+        <w:rPr>
+          <w:rFonts w:ascii="Times New Roman" w:hAnsi="Times New Roman"/>
+          <w:b/>
+          <w:sz w:val="28"/>
+        </w:rPr>
+        <w:t>«Агенты на лёгких тернарных моделях: root-cause исследование провала tool calling в инференс-стеке BitNet b1.58 2B»</w:t>
+      </w:r>
+    </w:p>
+    <w:p>
+      <w:pPr>
+        <w:spacing w:before="1440" w:after="0"/>
+        <w:jc w:val="right"/>
+      </w:pPr>
+      <w:r>
+        <w:rPr>
+          <w:rFonts w:ascii="Times New Roman" w:hAnsi="Times New Roman"/>
+          <w:b w:val="0"/>
+          <w:sz w:val="28"/>
+        </w:rPr>
+        <w:t>Автор:</w:t>
+      </w:r>
+    </w:p>
+    <w:p>
+      <w:pPr>
+        <w:spacing w:before="0" w:after="0"/>
+        <w:jc w:val="right"/>
+      </w:pPr>
+      <w:r>
+        <w:rPr>
+          <w:rFonts w:ascii="Times New Roman" w:hAnsi="Times New Roman"/>
+          <w:b w:val="0"/>
+          <w:sz w:val="28"/>
+        </w:rPr>
+        <w:t>[Фамилия Имя Отчество], студент [курс] курса, группа [номер]</w:t>
+      </w:r>
+    </w:p>
+    <w:p>
+      <w:pPr>
+        <w:spacing w:before="240" w:after="0"/>
+        <w:jc w:val="right"/>
+      </w:pPr>
+      <w:r>
+        <w:rPr>
+          <w:rFonts w:ascii="Times New Roman" w:hAnsi="Times New Roman"/>
+          <w:b w:val="0"/>
+          <w:sz w:val="28"/>
+        </w:rPr>
+        <w:t>Научный руководитель:</w:t>
+      </w:r>
+    </w:p>
+    <w:p>
+      <w:pPr>
+        <w:spacing w:before="0" w:after="0"/>
+        <w:jc w:val="right"/>
+      </w:pPr>
+      <w:r>
+        <w:rPr>
+          <w:rFonts w:ascii="Times New Roman" w:hAnsi="Times New Roman"/>
+          <w:b w:val="0"/>
+          <w:sz w:val="28"/>
+        </w:rPr>
+        <w:t>[Фамилия Имя Отчество], [должность, учёная степень]</w:t>
+      </w:r>
+    </w:p>
+    <w:p>
+      <w:pPr>
+        <w:spacing w:before="2880" w:after="0"/>
+        <w:jc w:val="center"/>
+      </w:pPr>
+      <w:r>
+        <w:rPr>
+          <w:rFonts w:ascii="Times New Roman" w:hAnsi="Times New Roman"/>
+          <w:b w:val="0"/>
+          <w:sz w:val="28"/>
+        </w:rPr>
+        <w:t>Москва</w:t>
+      </w:r>
+    </w:p>
+    <w:p>
+      <w:pPr>
+        <w:spacing w:before="0" w:after="0"/>
+        <w:jc w:val="center"/>
+      </w:pPr>
+      <w:r>
+        <w:rPr>
+          <w:rFonts w:ascii="Times New Roman" w:hAnsi="Times New Roman"/>
+          <w:b w:val="0"/>
+          <w:sz w:val="28"/>
+        </w:rPr>
+        <w:t>2026</w:t>
+      </w:r>
+    </w:p>
+    <w:p>
+      <w:r>
+        <w:br w:type="page"/>
+      </w:r>
+    </w:p>
+    <w:p>
+      <w:pPr>
         <w:pStyle w:val="Heading1"/>
       </w:pPr>
       <w:r>
@@ -18,7 +191,7 @@
         <w:t>Статус документа:</w:t>
       </w:r>
       <w:r>
-        <w:t xml:space="preserve"> рабочий черновик v2 (русский). Переписан с нуля на основе audit-слоя («Теор материалы») после того, как первоначальная интерпретация «деградации квантования» была опровергнута факторным экспериментом 2×2. Английская версия — после закрытия дыр фазы 1.</w:t>
+        <w:t xml:space="preserve"> версия для подачи v2.1 (финальная, русский). Переписан с нуля на основе audit-слоя («Теор материалы») после того, как первоначальная интерпретация «деградации квантования» была опровергнута факторным экспериментом 2×2; два раунда внешнего ревью закрыты, апстрим-верификация бага выполнена. Английская версия — опциональное продолжение.</w:t>
       </w:r>
     </w:p>
     <w:p>
@@ -29,7 +202,7 @@
         <w:t>Дата:</w:t>
       </w:r>
       <w:r>
-        <w:t xml:space="preserve"> 19 октября 2026</w:t>
+        <w:t xml:space="preserve"> 27 октября 2026</w:t>
       </w:r>
     </w:p>
     <w:p>
@@ -60,7 +233,7 @@
         <w:t>BENCHMARK_ARTIFACTS_MANIFEST.json</w:t>
       </w:r>
       <w:r>
-        <w:t xml:space="preserve">, 81 запись с SHA-256). Локальный архив: </w:t>
+        <w:t xml:space="preserve">, 84 записи с SHA-256). Локальный архив: </w:t>
       </w:r>
       <w:r>
         <w:rPr>
@@ -70,7 +243,7 @@
         <w:t>C:\ai_models\paper_artifacts\</w:t>
       </w:r>
       <w:r>
-        <w:t xml:space="preserve"> (ревизии от 19.10.2026).</w:t>
+        <w:t xml:space="preserve"> (ревизии от 27.10.2026).</w:t>
       </w:r>
     </w:p>
     <w:p>
@@ -8974,7 +9147,7 @@
         <w:pStyle w:val="Heading2"/>
       </w:pPr>
       <w:r>
-        <w:t>10. Следующие эксперименты (статус: фаза 1 выполнена 16.10.2026)</w:t>
+        <w:t>10. Выполненные эксперименты и отложенные направления</w:t>
       </w:r>
     </w:p>
     <w:p>
@@ -11660,7 +11833,7 @@
         <w:t>generate_t3_artifact.py</w:t>
       </w:r>
       <w:r>
-        <w:t xml:space="preserve">). Манифест: 73 → 81 запись (три ревизии T1/T2/T3, бэкапы). Публичный пакет воспроизводимости опубликован: [github.com/NoApexDB/bitnet-toolcalling-repro](https://github.com/NoApexDB/bitnet-toolcalling-repro), тег </w:t>
+        <w:t xml:space="preserve">). Манифест: 84 записи (ревизии 17.10–27.10; ревизия 27.10 фиксирует восстановление окружения после случайного удаления локальных моделей: Qwen GGUF перекачаны с официальных репо Hugging Face байт-в-байт, BitNet GGUF переконвертирован тем же конвертером — все 332 тензора байт-идентичны, файловый хэш отличается на метаданные тулчейна). Публичный пакет воспроизводимости опубликован: [github.com/NoApexDB/bitnet-toolcalling-repro](https://github.com/NoApexDB/bitnet-toolcalling-repro), тег </w:t>
       </w:r>
       <w:r>
         <w:rPr>
@@ -11695,7 +11868,7 @@
         <w:rPr>
           <w:b/>
         </w:rPr>
-        <w:t>68 из 73 файлов манифеста размещены байт-в-байт (SHA-256 сверены по raw-URL); не размещены 4 весовых файла по ~1.2 ГБ (ссылки Hugging Face и SHA-256 в README) и внутренний инструмент упаковки; внутренняя кухня (эксплораторные тесты, superseded-версии, предварительные отчёты) исключена из публикации и описана в инженерном логе</w:t>
+        <w:t>68 из 75 файлов манифеста размещены байт-в-байт (SHA-256 сверены по raw-URL); не размещены 6 весовых/GGUF-файлов (ссылки Hugging Face и верифицированные SHA-256 в README, включая ноту о воспроизводимости конверсии) и внутренний инструмент упаковки; внутренняя кухня (эксплораторные тесты, superseded-версии, предварительные отчёты) исключена из публикации и описана в инженерном логе</w:t>
       </w:r>
       <w:r>
         <w:t>.</w:t>

</xml_diff>